<commit_message>
Add confirmed UK registered office address to incorporation package
</commit_message>
<xml_diff>
--- a/uk_incorporation/ZeroPay_Money_UK_Incorporation_Package.docx
+++ b/uk_incorporation/ZeroPay_Money_UK_Incorporation_Package.docx
@@ -103,7 +103,7 @@
         <w:rPr>
           <w:sz w:val="32"/>
         </w:rPr>
-        <w:t>Proposed registered office: Tom's wife's UK residential address (Mrs Oyetoro Adeyemi-Ugbodaga, London) — NEEDS the actual full address confirmed before filing. A registered office does not have to be a business premises; a home address is acceptable, though it becomes publicly visible on the Companies House register unless a registered office address service is used instead (small extra annual cost).</w:t>
+        <w:t>Registered office: 15 Fleming House, Dickens Estate, George Row, London, SE16 4UL (Mrs Oyetoro Adeyemi-Ugbodaga's UK address). Note: this address will be publicly visible on the Companies House register once filed, unless a registered office address service is used instead.</w:t>
       </w:r>
     </w:p>
     <w:p>
@@ -387,7 +387,7 @@
         <w:rPr>
           <w:sz w:val="32"/>
         </w:rPr>
-        <w:t>Full UK registered office address (Mrs Adeyemi-Ugbodaga's address, or confirm using an address service instead)</w:t>
+        <w:t>CONFIRMED: 15 Fleming House, Dickens Estate, George Row, London, SE16 4UL</w:t>
       </w:r>
     </w:p>
     <w:p>

</xml_diff>

<commit_message>
Add director service addresses - Tom/wife confirmed, AVM Morgan pending
</commit_message>
<xml_diff>
--- a/uk_incorporation/ZeroPay_Money_UK_Incorporation_Package.docx
+++ b/uk_incorporation/ZeroPay_Money_UK_Incorporation_Package.docx
@@ -133,7 +133,7 @@
         <w:rPr>
           <w:sz w:val="32"/>
         </w:rPr>
-        <w:t>Tom Deggs Ugbodaga - Director (Nigeria-resident)</w:t>
+        <w:t>Tom Deggs Ugbodaga - Director. Service address: 15 Fleming House, Dickens Estate, George Row, London, SE16 4UL</w:t>
       </w:r>
     </w:p>
     <w:p>
@@ -144,7 +144,7 @@
         <w:rPr>
           <w:sz w:val="32"/>
         </w:rPr>
-        <w:t>Mrs Oyetoro Adeyemi-Ugbodaga - Director (UK-resident, London)</w:t>
+        <w:t>Mrs Oyetoro Adeyemi-Ugbodaga - Director (UK-resident, London). Service address: 15 Fleming House, Dickens Estate, George Row, London, SE16 4UL</w:t>
       </w:r>
     </w:p>
     <w:p>
@@ -155,7 +155,7 @@
         <w:rPr>
           <w:sz w:val="32"/>
         </w:rPr>
-        <w:t>Air Vice Marshal Monday Riku Morgan (Rtd) - Director (Nigeria-resident)</w:t>
+        <w:t>Air Vice Marshal Monday Riku Morgan (Rtd) - Director. Service address: PENDING - Tom to send AVM Morgan's UK address</w:t>
       </w:r>
     </w:p>
     <w:p>
@@ -166,7 +166,7 @@
         <w:rPr>
           <w:sz w:val="32"/>
         </w:rPr>
-        <w:t>Professor (Mrs) Regina Morgan - Director</w:t>
+        <w:t>Professor (Mrs) Regina Morgan - Director (AVM Morgan's wife). Service address: PENDING - same UK address as AVM Morgan, to be sent by Tom</w:t>
       </w:r>
     </w:p>
     <w:p>

</xml_diff>

<commit_message>
Confirm Option B ownership - 4 individual shareholders, Tom as PSC
</commit_message>
<xml_diff>
--- a/uk_incorporation/ZeroPay_Money_UK_Incorporation_Package.docx
+++ b/uk_incorporation/ZeroPay_Money_UK_Incorporation_Package.docx
@@ -192,7 +192,7 @@
           <w:b/>
           <w:sz w:val="32"/>
         </w:rPr>
-        <w:t>Two structural options - Tom to choose:</w:t>
+        <w:t>DECISION CONFIRMED (Sep 2, 2026): Option B - ZeroPay Money Limited is owned directly by the 4 named individuals as shareholders. Tom Deggs Ugbodaga is the Person with Significant Control (PSC).</w:t>
       </w:r>
     </w:p>
     <w:p>
@@ -203,7 +203,7 @@
         <w:rPr>
           <w:sz w:val="32"/>
         </w:rPr>
-        <w:t>Option A (recommended): ZeroPay Money Limited is a wholly-owned UK subsidiary of BETONIQ WEST LTD (Nigeria). Keeps BETONIQ WEST as the parent/IP owner, UK entity as the grant-eligible operating arm. Cleaner for future investor cap table and tax structuring.</w:t>
+        <w:t>[Superseded] Option A - UK subsidiary of BETONIQ WEST LTD - NOT chosen.</w:t>
       </w:r>
     </w:p>
     <w:p>
@@ -214,7 +214,7 @@
         <w:rPr>
           <w:sz w:val="32"/>
         </w:rPr>
-        <w:t>Option B: ZeroPay Money Limited is owned directly by the 4 named individuals as personal shareholders (e.g. matching or distinct from the BETONIQ WEST equity split). Simpler and faster to register today, but means IP/technology would need a separate licensing or assignment agreement between BETONIQ WEST LTD and ZeroPay Money Limited later.</w:t>
+        <w:t>CHOSEN - Option B: owned directly by the 4 individuals. Share allocation percentage among the 4 still needed - Tom to confirm split (must give Tom &gt;25% shares/voting rights or equivalent control right to be registered as sole PSC on the PSC register).</w:t>
       </w:r>
     </w:p>
     <w:p>
@@ -398,7 +398,7 @@
         <w:rPr>
           <w:sz w:val="32"/>
         </w:rPr>
-        <w:t>Decision: Option A (UK subsidiary of BETONIQ WEST) vs Option B (directly owned by the 4 individuals)</w:t>
+        <w:t>CONFIRMED: Option B chosen. STILL NEEDED: exact share % split among the 4 individuals (Tom as PSC needs &gt;25% or another qualifying control right).</w:t>
       </w:r>
     </w:p>
     <w:p>

</xml_diff>

<commit_message>
Confirm final share split: Tom 50/AVM Morgan 25/Mrs Adeyemi-Ugbodaga 15/Prof Regina Morgan 10
</commit_message>
<xml_diff>
--- a/uk_incorporation/ZeroPay_Money_UK_Incorporation_Package.docx
+++ b/uk_incorporation/ZeroPay_Money_UK_Incorporation_Package.docx
@@ -214,7 +214,7 @@
         <w:rPr>
           <w:sz w:val="32"/>
         </w:rPr>
-        <w:t>CHOSEN - Option B: owned directly by the 4 individuals. Share allocation percentage among the 4 still needed - Tom to confirm split (must give Tom &gt;25% shares/voting rights or equivalent control right to be registered as sole PSC on the PSC register).</w:t>
+        <w:t>CONFIRMED SHARE SPLIT (Sep 2, 2026): Tom Deggs Ugbodaga 50%, AVM Monday Riku Morgan (Rtd) 25%, Mrs Oyetoro Adeyemi-Ugbodaga 15%, Professor (Mrs) Regina Morgan 10%. Total = 100%. Tom holds 50% &gt; 25% threshold, correctly qualifying as sole PSC on the PSC register.</w:t>
       </w:r>
     </w:p>
     <w:p>
@@ -398,7 +398,7 @@
         <w:rPr>
           <w:sz w:val="32"/>
         </w:rPr>
-        <w:t>CONFIRMED: Option B chosen. STILL NEEDED: exact share % split among the 4 individuals (Tom as PSC needs &gt;25% or another qualifying control right).</w:t>
+        <w:t>CONFIRMED: Share split finalized - Tom 50%, AVM Morgan 25%, Mrs Adeyemi-Ugbodaga 15%, Prof Regina Morgan 10% (Tom = sole PSC at 50%).</w:t>
       </w:r>
     </w:p>
     <w:p>

</xml_diff>

<commit_message>
Add bespoke Articles: director appointment right + Bushell v Faith weighted removal vote
</commit_message>
<xml_diff>
--- a/uk_incorporation/ZeroPay_Money_UK_Incorporation_Package.docx
+++ b/uk_incorporation/ZeroPay_Money_UK_Incorporation_Package.docx
@@ -421,6 +421,101 @@
         <w:t>-- End of package. Ready to file once the above three inputs are confirmed. --</w:t>
       </w:r>
     </w:p>
+    <w:p>
+      <w:pPr>
+        <w:pStyle w:val="Heading1"/>
+      </w:pPr>
+      <w:r>
+        <w:t>9. Bespoke Article - Reserved Director Appointment Right + Weighted Removal Vote (Added Sep 2, 2026)</w:t>
+      </w:r>
+    </w:p>
+    <w:p>
+      <w:r>
+        <w:rPr>
+          <w:b/>
+          <w:sz w:val="32"/>
+        </w:rPr>
+        <w:t>Tom has confirmed he wants guaranteed control over adding/removing directors, beyond what plain 50% shareholding gives him. Standard Model Articles are therefore NOT sufficient here - bespoke Articles are required. Draft clauses below:</w:t>
+      </w:r>
+    </w:p>
+    <w:p>
+      <w:pPr>
+        <w:pStyle w:val="Heading1"/>
+      </w:pPr>
+      <w:r>
+        <w:t>9.1 Appointment of Directors (fully valid under UK law)</w:t>
+      </w:r>
+    </w:p>
+    <w:p>
+      <w:r>
+        <w:rPr>
+          <w:b w:val="0"/>
+          <w:sz w:val="32"/>
+        </w:rPr>
+        <w:t>Draft clause: "Notwithstanding Model Article 17, for so long as Tom Deggs Ugbodaga holds any ordinary shares in the Company, he shall have the personal right, exercisable at any time by written notice to the Company, to appoint any person as an additional director of the Company, without requiring a board resolution or shareholder resolution. This is a personal right attached to Tom Deggs Ugbodaga individually while he remains a shareholder."</w:t>
+      </w:r>
+    </w:p>
+    <w:p>
+      <w:r>
+        <w:rPr>
+          <w:b w:val="0"/>
+          <w:sz w:val="32"/>
+        </w:rPr>
+        <w:t>This works cleanly under UK company law - many private companies give a founder/majority shareholder a personal reserved right like this in the Articles.</w:t>
+      </w:r>
+    </w:p>
+    <w:p>
+      <w:pPr>
+        <w:pStyle w:val="Heading1"/>
+      </w:pPr>
+      <w:r>
+        <w:t>9.2 Removal of Directors (needs a weighted-voting structure, not a flat override)</w:t>
+      </w:r>
+    </w:p>
+    <w:p>
+      <w:r>
+        <w:rPr>
+          <w:b w:val="0"/>
+          <w:sz w:val="32"/>
+        </w:rPr>
+        <w:t>Legal limitation: Companies Act 2006 section 168 gives ALL shareholders a statutory right to remove any director by ordinary resolution "notwithstanding any provision in the company's articles" - this specific right cannot be fully written away, even in bespoke Articles.</w:t>
+      </w:r>
+    </w:p>
+    <w:p>
+      <w:r>
+        <w:rPr>
+          <w:b w:val="0"/>
+          <w:sz w:val="32"/>
+        </w:rPr>
+        <w:t>Standard UK workaround (the "Bushell v Faith clause", upheld by the House of Lords in Bushell v Faith [1970]): give Tom's shares weighted voting rights specifically on any resolution to remove a director - e.g. his shares carry 3x voting weight on removal resolutions only (normal 1x weight on everything else). Draft clause: "On any resolution proposed to remove a director from office under section 168 of the Companies Act 2006, each ordinary share held by Tom Deggs Ugbodaga shall carry three (3) votes instead of one, for so long as he remains a director of the Company. This weighted voting right does not apply to any other resolution."</w:t>
+      </w:r>
+    </w:p>
+    <w:p>
+      <w:r>
+        <w:rPr>
+          <w:b w:val="0"/>
+          <w:sz w:val="32"/>
+        </w:rPr>
+        <w:t>Effect: at 50% shares with a 3x weighting specifically on removal votes, Tom effectively cannot be outvoted on any removal resolution (his own or another director's), giving him practical control matching his intent, while staying within what UK law actually permits.</w:t>
+      </w:r>
+    </w:p>
+    <w:p>
+      <w:pPr>
+        <w:pStyle w:val="Heading1"/>
+      </w:pPr>
+      <w:r>
+        <w:t>9.3 Important Caveat</w:t>
+      </w:r>
+    </w:p>
+    <w:p>
+      <w:r>
+        <w:rPr>
+          <w:b/>
+          <w:sz w:val="32"/>
+        </w:rPr>
+        <w:t>Bespoke Articles carry more legal risk than Model Articles if drafted imprecisely - recommend a UK company solicitor reviews this exact wording before it is filed at incorporation (Articles are far harder/costlier to amend after the fact than to get right on day one). This draft is a strong starting point, not a substitute for that review.</w:t>
+      </w:r>
+    </w:p>
     <w:sectPr>
       <w:pgSz w:w="12240" w:h="15840"/>
       <w:pgMar w:top="1440" w:right="1800" w:bottom="1440" w:left="1800" w:header="720" w:footer="720" w:gutter="0"/>

</xml_diff>